<commit_message>
Drop the unfilled user-testing slide from the deck
</commit_message>
<xml_diff>
--- a/deck/custody-deck.docx
+++ b/deck/custody-deck.docx
@@ -41,7 +41,7 @@
           <w:sz w:val="18"/>
           <w:szCs w:val="18"/>
         </w:rPr>
-        <w:t xml:space="preserve">Presentation deck, 13 slides.  Team Captain.  ICSC 2026 Universities Hackathon, Track H.</w:t>
+        <w:t xml:space="preserve">Presentation deck, 12 slides.  Team Captain.  ICSC 2026 Universities Hackathon, Track H.</w:t>
       </w:r>
     </w:p>
     <w:p>
@@ -1401,7 +1401,7 @@
           <w:sz w:val="16"/>
           <w:szCs w:val="16"/>
         </w:rPr>
-        <w:t xml:space="preserve">    We tested it on people</w:t>
+        <w:t xml:space="preserve">    What we did not solve</w:t>
       </w:r>
     </w:p>
     <w:p>
@@ -1416,7 +1416,7 @@
           <w:sz w:val="28"/>
           <w:szCs w:val="28"/>
         </w:rPr>
-        <w:t xml:space="preserve">We gave the report to someone outside computer science.</w:t>
+        <w:t xml:space="preserve">Honest limits</w:t>
       </w:r>
     </w:p>
     <w:tbl>
@@ -1457,7 +1457,7 @@
                 <w:sz w:val="20"/>
                 <w:szCs w:val="20"/>
               </w:rPr>
-              <w:t xml:space="preserve">What confused them</w:t>
+              <w:t xml:space="preserve">A corrupt collector</w:t>
             </w:r>
           </w:p>
         </w:tc>
@@ -1480,7 +1480,7 @@
                 <w:sz w:val="20"/>
                 <w:szCs w:val="20"/>
               </w:rPr>
-              <w:t xml:space="preserve">[ to complete ]</w:t>
+              <w:t xml:space="preserve">protected from collection onward, not before it</w:t>
             </w:r>
           </w:p>
         </w:tc>
@@ -1507,7 +1507,7 @@
                 <w:sz w:val="20"/>
                 <w:szCs w:val="20"/>
               </w:rPr>
-              <w:t xml:space="preserve">What we changed</w:t>
+              <w:t xml:space="preserve">The device clock</w:t>
             </w:r>
           </w:p>
         </w:tc>
@@ -1530,7 +1530,207 @@
                 <w:sz w:val="20"/>
                 <w:szCs w:val="20"/>
               </w:rPr>
-              <w:t xml:space="preserve">[ to complete ]</w:t>
+              <w:t xml:space="preserve">both clocks shown, the phone's not vouched for</w:t>
+            </w:r>
+          </w:p>
+        </w:tc>
+      </w:tr>
+      <w:tr>
+        <w:tc>
+          <w:tcPr>
+            <w:tcW w:type="dxa" w:w="2600"/>
+            <w:tcMar>
+              <w:top w:type="dxa" w:w="40"/>
+              <w:bottom w:type="dxa" w:w="80"/>
+              <w:right w:type="dxa" w:w="160"/>
+            </w:tcMar>
+          </w:tcPr>
+          <w:p>
+            <w:pPr>
+              <w:jc w:val="left"/>
+            </w:pPr>
+            <w:r>
+              <w:rPr>
+                <w:rFonts w:ascii="Times New Roman" w:cs="Times New Roman" w:eastAsia="Times New Roman" w:hAnsi="Times New Roman"/>
+                <w:b/>
+                <w:bCs/>
+                <w:sz w:val="20"/>
+                <w:szCs w:val="20"/>
+              </w:rPr>
+              <w:t xml:space="preserve">Scale</w:t>
+            </w:r>
+          </w:p>
+        </w:tc>
+        <w:tc>
+          <w:tcPr>
+            <w:tcW w:type="dxa" w:w="6426"/>
+            <w:tcMar>
+              <w:top w:type="dxa" w:w="40"/>
+              <w:bottom w:type="dxa" w:w="80"/>
+            </w:tcMar>
+          </w:tcPr>
+          <w:p>
+            <w:pPr>
+              <w:spacing w:line="260"/>
+              <w:jc w:val="both"/>
+            </w:pPr>
+            <w:r>
+              <w:rPr>
+                <w:rFonts w:ascii="Times New Roman" w:cs="Times New Roman" w:eastAsia="Times New Roman" w:hAnsi="Times New Roman"/>
+                <w:sz w:val="20"/>
+                <w:szCs w:val="20"/>
+              </w:rPr>
+              <w:t xml:space="preserve">tested at 30MB, extrapolated, not a real extraction</w:t>
+            </w:r>
+          </w:p>
+        </w:tc>
+      </w:tr>
+      <w:tr>
+        <w:tc>
+          <w:tcPr>
+            <w:tcW w:type="dxa" w:w="2600"/>
+            <w:tcMar>
+              <w:top w:type="dxa" w:w="40"/>
+              <w:bottom w:type="dxa" w:w="80"/>
+              <w:right w:type="dxa" w:w="160"/>
+            </w:tcMar>
+          </w:tcPr>
+          <w:p>
+            <w:pPr>
+              <w:jc w:val="left"/>
+            </w:pPr>
+            <w:r>
+              <w:rPr>
+                <w:rFonts w:ascii="Times New Roman" w:cs="Times New Roman" w:eastAsia="Times New Roman" w:hAnsi="Times New Roman"/>
+                <w:b/>
+                <w:bCs/>
+                <w:sz w:val="20"/>
+                <w:szCs w:val="20"/>
+              </w:rPr>
+              <w:t xml:space="preserve">Per officer signing</w:t>
+            </w:r>
+          </w:p>
+        </w:tc>
+        <w:tc>
+          <w:tcPr>
+            <w:tcW w:type="dxa" w:w="6426"/>
+            <w:tcMar>
+              <w:top w:type="dxa" w:w="40"/>
+              <w:bottom w:type="dxa" w:w="80"/>
+            </w:tcMar>
+          </w:tcPr>
+          <w:p>
+            <w:pPr>
+              <w:spacing w:line="260"/>
+              <w:jc w:val="both"/>
+            </w:pPr>
+            <w:r>
+              <w:rPr>
+                <w:rFonts w:ascii="Times New Roman" w:cs="Times New Roman" w:eastAsia="Times New Roman" w:hAnsi="Times New Roman"/>
+                <w:sz w:val="20"/>
+                <w:szCs w:val="20"/>
+              </w:rPr>
+              <w:t xml:space="preserve">tied to a login, not to a person's key</w:t>
+            </w:r>
+          </w:p>
+        </w:tc>
+      </w:tr>
+      <w:tr>
+        <w:tc>
+          <w:tcPr>
+            <w:tcW w:type="dxa" w:w="2600"/>
+            <w:tcMar>
+              <w:top w:type="dxa" w:w="40"/>
+              <w:bottom w:type="dxa" w:w="80"/>
+              <w:right w:type="dxa" w:w="160"/>
+            </w:tcMar>
+          </w:tcPr>
+          <w:p>
+            <w:pPr>
+              <w:jc w:val="left"/>
+            </w:pPr>
+            <w:r>
+              <w:rPr>
+                <w:rFonts w:ascii="Times New Roman" w:cs="Times New Roman" w:eastAsia="Times New Roman" w:hAnsi="Times New Roman"/>
+                <w:b/>
+                <w:bCs/>
+                <w:sz w:val="20"/>
+                <w:szCs w:val="20"/>
+              </w:rPr>
+              <w:t xml:space="preserve">Storage</w:t>
+            </w:r>
+          </w:p>
+        </w:tc>
+        <w:tc>
+          <w:tcPr>
+            <w:tcW w:type="dxa" w:w="6426"/>
+            <w:tcMar>
+              <w:top w:type="dxa" w:w="40"/>
+              <w:bottom w:type="dxa" w:w="80"/>
+            </w:tcMar>
+          </w:tcPr>
+          <w:p>
+            <w:pPr>
+              <w:spacing w:line="260"/>
+              <w:jc w:val="both"/>
+            </w:pPr>
+            <w:r>
+              <w:rPr>
+                <w:rFonts w:ascii="Times New Roman" w:cs="Times New Roman" w:eastAsia="Times New Roman" w:hAnsi="Times New Roman"/>
+                <w:sz w:val="20"/>
+                <w:szCs w:val="20"/>
+              </w:rPr>
+              <w:t xml:space="preserve">change is proven, deletion is not prevented</w:t>
+            </w:r>
+          </w:p>
+        </w:tc>
+      </w:tr>
+      <w:tr>
+        <w:tc>
+          <w:tcPr>
+            <w:tcW w:type="dxa" w:w="2600"/>
+            <w:tcMar>
+              <w:top w:type="dxa" w:w="40"/>
+              <w:bottom w:type="dxa" w:w="80"/>
+              <w:right w:type="dxa" w:w="160"/>
+            </w:tcMar>
+          </w:tcPr>
+          <w:p>
+            <w:pPr>
+              <w:jc w:val="left"/>
+            </w:pPr>
+            <w:r>
+              <w:rPr>
+                <w:rFonts w:ascii="Times New Roman" w:cs="Times New Roman" w:eastAsia="Times New Roman" w:hAnsi="Times New Roman"/>
+                <w:b/>
+                <w:bCs/>
+                <w:sz w:val="20"/>
+                <w:szCs w:val="20"/>
+              </w:rPr>
+              <w:t xml:space="preserve">Bulk compromise</w:t>
+            </w:r>
+          </w:p>
+        </w:tc>
+        <w:tc>
+          <w:tcPr>
+            <w:tcW w:type="dxa" w:w="6426"/>
+            <w:tcMar>
+              <w:top w:type="dxa" w:w="40"/>
+              <w:bottom w:type="dxa" w:w="80"/>
+            </w:tcMar>
+          </w:tcPr>
+          <w:p>
+            <w:pPr>
+              <w:spacing w:line="260"/>
+              <w:jc w:val="both"/>
+            </w:pPr>
+            <w:r>
+              <w:rPr>
+                <w:rFonts w:ascii="Times New Roman" w:cs="Times New Roman" w:eastAsia="Times New Roman" w:hAnsi="Times New Roman"/>
+                <w:sz w:val="20"/>
+                <w:szCs w:val="20"/>
+              </w:rPr>
+              <w:t xml:space="preserve">single edits are caught, a full rewrite is not</w:t>
             </w:r>
           </w:p>
         </w:tc>
@@ -1563,7 +1763,7 @@
           <w:sz w:val="18"/>
           <w:szCs w:val="18"/>
         </w:rPr>
-        <w:t xml:space="preserve">Complete this with the real result before presenting. An accurate account of what a reader did not understand is the only version worth reporting.</w:t>
+        <w:t xml:space="preserve">Deliver this confidently, not apologetically. If pressed on the last row: the events table is append only and witnesses the fingerprint, so editing one record is reported. Defeating it means dropping the trigger and rewriting every table.</w:t>
       </w:r>
     </w:p>
     <w:p>
@@ -1589,402 +1789,6 @@
           <w:szCs w:val="16"/>
         </w:rPr>
         <w:t xml:space="preserve">Slide 12</w:t>
-      </w:r>
-      <w:r>
-        <w:rPr>
-          <w:rFonts w:ascii="Times New Roman" w:cs="Times New Roman" w:eastAsia="Times New Roman" w:hAnsi="Times New Roman"/>
-          <w:color w:val="5A5A52"/>
-          <w:sz w:val="16"/>
-          <w:szCs w:val="16"/>
-        </w:rPr>
-        <w:t xml:space="preserve">    What we did not solve</w:t>
-      </w:r>
-    </w:p>
-    <w:p>
-      <w:pPr>
-        <w:spacing w:after="120" w:before="80"/>
-      </w:pPr>
-      <w:r>
-        <w:rPr>
-          <w:rFonts w:ascii="Times New Roman" w:cs="Times New Roman" w:eastAsia="Times New Roman" w:hAnsi="Times New Roman"/>
-          <w:b/>
-          <w:bCs/>
-          <w:sz w:val="28"/>
-          <w:szCs w:val="28"/>
-        </w:rPr>
-        <w:t xml:space="preserve">Honest limits</w:t>
-      </w:r>
-    </w:p>
-    <w:tbl>
-      <w:tblPr>
-        <w:tblW w:type="dxa" w:w="9026"/>
-        <w:tblBorders>
-          <w:top w:val="none"/>
-          <w:left w:val="none"/>
-          <w:bottom w:val="none"/>
-          <w:right w:val="none"/>
-          <w:insideH w:val="none"/>
-          <w:insideV w:val="none"/>
-        </w:tblBorders>
-      </w:tblPr>
-      <w:tblGrid>
-        <w:gridCol w:w="2600"/>
-        <w:gridCol w:w="6426"/>
-      </w:tblGrid>
-      <w:tr>
-        <w:tc>
-          <w:tcPr>
-            <w:tcW w:type="dxa" w:w="2600"/>
-            <w:tcMar>
-              <w:top w:type="dxa" w:w="40"/>
-              <w:bottom w:type="dxa" w:w="80"/>
-              <w:right w:type="dxa" w:w="160"/>
-            </w:tcMar>
-          </w:tcPr>
-          <w:p>
-            <w:pPr>
-              <w:jc w:val="left"/>
-            </w:pPr>
-            <w:r>
-              <w:rPr>
-                <w:rFonts w:ascii="Times New Roman" w:cs="Times New Roman" w:eastAsia="Times New Roman" w:hAnsi="Times New Roman"/>
-                <w:b/>
-                <w:bCs/>
-                <w:sz w:val="20"/>
-                <w:szCs w:val="20"/>
-              </w:rPr>
-              <w:t xml:space="preserve">A corrupt collector</w:t>
-            </w:r>
-          </w:p>
-        </w:tc>
-        <w:tc>
-          <w:tcPr>
-            <w:tcW w:type="dxa" w:w="6426"/>
-            <w:tcMar>
-              <w:top w:type="dxa" w:w="40"/>
-              <w:bottom w:type="dxa" w:w="80"/>
-            </w:tcMar>
-          </w:tcPr>
-          <w:p>
-            <w:pPr>
-              <w:spacing w:line="260"/>
-              <w:jc w:val="both"/>
-            </w:pPr>
-            <w:r>
-              <w:rPr>
-                <w:rFonts w:ascii="Times New Roman" w:cs="Times New Roman" w:eastAsia="Times New Roman" w:hAnsi="Times New Roman"/>
-                <w:sz w:val="20"/>
-                <w:szCs w:val="20"/>
-              </w:rPr>
-              <w:t xml:space="preserve">protected from collection onward, not before it</w:t>
-            </w:r>
-          </w:p>
-        </w:tc>
-      </w:tr>
-      <w:tr>
-        <w:tc>
-          <w:tcPr>
-            <w:tcW w:type="dxa" w:w="2600"/>
-            <w:tcMar>
-              <w:top w:type="dxa" w:w="40"/>
-              <w:bottom w:type="dxa" w:w="80"/>
-              <w:right w:type="dxa" w:w="160"/>
-            </w:tcMar>
-          </w:tcPr>
-          <w:p>
-            <w:pPr>
-              <w:jc w:val="left"/>
-            </w:pPr>
-            <w:r>
-              <w:rPr>
-                <w:rFonts w:ascii="Times New Roman" w:cs="Times New Roman" w:eastAsia="Times New Roman" w:hAnsi="Times New Roman"/>
-                <w:b/>
-                <w:bCs/>
-                <w:sz w:val="20"/>
-                <w:szCs w:val="20"/>
-              </w:rPr>
-              <w:t xml:space="preserve">The device clock</w:t>
-            </w:r>
-          </w:p>
-        </w:tc>
-        <w:tc>
-          <w:tcPr>
-            <w:tcW w:type="dxa" w:w="6426"/>
-            <w:tcMar>
-              <w:top w:type="dxa" w:w="40"/>
-              <w:bottom w:type="dxa" w:w="80"/>
-            </w:tcMar>
-          </w:tcPr>
-          <w:p>
-            <w:pPr>
-              <w:spacing w:line="260"/>
-              <w:jc w:val="both"/>
-            </w:pPr>
-            <w:r>
-              <w:rPr>
-                <w:rFonts w:ascii="Times New Roman" w:cs="Times New Roman" w:eastAsia="Times New Roman" w:hAnsi="Times New Roman"/>
-                <w:sz w:val="20"/>
-                <w:szCs w:val="20"/>
-              </w:rPr>
-              <w:t xml:space="preserve">both clocks shown, the phone's not vouched for</w:t>
-            </w:r>
-          </w:p>
-        </w:tc>
-      </w:tr>
-      <w:tr>
-        <w:tc>
-          <w:tcPr>
-            <w:tcW w:type="dxa" w:w="2600"/>
-            <w:tcMar>
-              <w:top w:type="dxa" w:w="40"/>
-              <w:bottom w:type="dxa" w:w="80"/>
-              <w:right w:type="dxa" w:w="160"/>
-            </w:tcMar>
-          </w:tcPr>
-          <w:p>
-            <w:pPr>
-              <w:jc w:val="left"/>
-            </w:pPr>
-            <w:r>
-              <w:rPr>
-                <w:rFonts w:ascii="Times New Roman" w:cs="Times New Roman" w:eastAsia="Times New Roman" w:hAnsi="Times New Roman"/>
-                <w:b/>
-                <w:bCs/>
-                <w:sz w:val="20"/>
-                <w:szCs w:val="20"/>
-              </w:rPr>
-              <w:t xml:space="preserve">Scale</w:t>
-            </w:r>
-          </w:p>
-        </w:tc>
-        <w:tc>
-          <w:tcPr>
-            <w:tcW w:type="dxa" w:w="6426"/>
-            <w:tcMar>
-              <w:top w:type="dxa" w:w="40"/>
-              <w:bottom w:type="dxa" w:w="80"/>
-            </w:tcMar>
-          </w:tcPr>
-          <w:p>
-            <w:pPr>
-              <w:spacing w:line="260"/>
-              <w:jc w:val="both"/>
-            </w:pPr>
-            <w:r>
-              <w:rPr>
-                <w:rFonts w:ascii="Times New Roman" w:cs="Times New Roman" w:eastAsia="Times New Roman" w:hAnsi="Times New Roman"/>
-                <w:sz w:val="20"/>
-                <w:szCs w:val="20"/>
-              </w:rPr>
-              <w:t xml:space="preserve">tested at 30MB, extrapolated, not a real extraction</w:t>
-            </w:r>
-          </w:p>
-        </w:tc>
-      </w:tr>
-      <w:tr>
-        <w:tc>
-          <w:tcPr>
-            <w:tcW w:type="dxa" w:w="2600"/>
-            <w:tcMar>
-              <w:top w:type="dxa" w:w="40"/>
-              <w:bottom w:type="dxa" w:w="80"/>
-              <w:right w:type="dxa" w:w="160"/>
-            </w:tcMar>
-          </w:tcPr>
-          <w:p>
-            <w:pPr>
-              <w:jc w:val="left"/>
-            </w:pPr>
-            <w:r>
-              <w:rPr>
-                <w:rFonts w:ascii="Times New Roman" w:cs="Times New Roman" w:eastAsia="Times New Roman" w:hAnsi="Times New Roman"/>
-                <w:b/>
-                <w:bCs/>
-                <w:sz w:val="20"/>
-                <w:szCs w:val="20"/>
-              </w:rPr>
-              <w:t xml:space="preserve">Per officer signing</w:t>
-            </w:r>
-          </w:p>
-        </w:tc>
-        <w:tc>
-          <w:tcPr>
-            <w:tcW w:type="dxa" w:w="6426"/>
-            <w:tcMar>
-              <w:top w:type="dxa" w:w="40"/>
-              <w:bottom w:type="dxa" w:w="80"/>
-            </w:tcMar>
-          </w:tcPr>
-          <w:p>
-            <w:pPr>
-              <w:spacing w:line="260"/>
-              <w:jc w:val="both"/>
-            </w:pPr>
-            <w:r>
-              <w:rPr>
-                <w:rFonts w:ascii="Times New Roman" w:cs="Times New Roman" w:eastAsia="Times New Roman" w:hAnsi="Times New Roman"/>
-                <w:sz w:val="20"/>
-                <w:szCs w:val="20"/>
-              </w:rPr>
-              <w:t xml:space="preserve">tied to a login, not to a person's key</w:t>
-            </w:r>
-          </w:p>
-        </w:tc>
-      </w:tr>
-      <w:tr>
-        <w:tc>
-          <w:tcPr>
-            <w:tcW w:type="dxa" w:w="2600"/>
-            <w:tcMar>
-              <w:top w:type="dxa" w:w="40"/>
-              <w:bottom w:type="dxa" w:w="80"/>
-              <w:right w:type="dxa" w:w="160"/>
-            </w:tcMar>
-          </w:tcPr>
-          <w:p>
-            <w:pPr>
-              <w:jc w:val="left"/>
-            </w:pPr>
-            <w:r>
-              <w:rPr>
-                <w:rFonts w:ascii="Times New Roman" w:cs="Times New Roman" w:eastAsia="Times New Roman" w:hAnsi="Times New Roman"/>
-                <w:b/>
-                <w:bCs/>
-                <w:sz w:val="20"/>
-                <w:szCs w:val="20"/>
-              </w:rPr>
-              <w:t xml:space="preserve">Storage</w:t>
-            </w:r>
-          </w:p>
-        </w:tc>
-        <w:tc>
-          <w:tcPr>
-            <w:tcW w:type="dxa" w:w="6426"/>
-            <w:tcMar>
-              <w:top w:type="dxa" w:w="40"/>
-              <w:bottom w:type="dxa" w:w="80"/>
-            </w:tcMar>
-          </w:tcPr>
-          <w:p>
-            <w:pPr>
-              <w:spacing w:line="260"/>
-              <w:jc w:val="both"/>
-            </w:pPr>
-            <w:r>
-              <w:rPr>
-                <w:rFonts w:ascii="Times New Roman" w:cs="Times New Roman" w:eastAsia="Times New Roman" w:hAnsi="Times New Roman"/>
-                <w:sz w:val="20"/>
-                <w:szCs w:val="20"/>
-              </w:rPr>
-              <w:t xml:space="preserve">change is proven, deletion is not prevented</w:t>
-            </w:r>
-          </w:p>
-        </w:tc>
-      </w:tr>
-      <w:tr>
-        <w:tc>
-          <w:tcPr>
-            <w:tcW w:type="dxa" w:w="2600"/>
-            <w:tcMar>
-              <w:top w:type="dxa" w:w="40"/>
-              <w:bottom w:type="dxa" w:w="80"/>
-              <w:right w:type="dxa" w:w="160"/>
-            </w:tcMar>
-          </w:tcPr>
-          <w:p>
-            <w:pPr>
-              <w:jc w:val="left"/>
-            </w:pPr>
-            <w:r>
-              <w:rPr>
-                <w:rFonts w:ascii="Times New Roman" w:cs="Times New Roman" w:eastAsia="Times New Roman" w:hAnsi="Times New Roman"/>
-                <w:b/>
-                <w:bCs/>
-                <w:sz w:val="20"/>
-                <w:szCs w:val="20"/>
-              </w:rPr>
-              <w:t xml:space="preserve">Bulk compromise</w:t>
-            </w:r>
-          </w:p>
-        </w:tc>
-        <w:tc>
-          <w:tcPr>
-            <w:tcW w:type="dxa" w:w="6426"/>
-            <w:tcMar>
-              <w:top w:type="dxa" w:w="40"/>
-              <w:bottom w:type="dxa" w:w="80"/>
-            </w:tcMar>
-          </w:tcPr>
-          <w:p>
-            <w:pPr>
-              <w:spacing w:line="260"/>
-              <w:jc w:val="both"/>
-            </w:pPr>
-            <w:r>
-              <w:rPr>
-                <w:rFonts w:ascii="Times New Roman" w:cs="Times New Roman" w:eastAsia="Times New Roman" w:hAnsi="Times New Roman"/>
-                <w:sz w:val="20"/>
-                <w:szCs w:val="20"/>
-              </w:rPr>
-              <w:t xml:space="preserve">single edits are caught, a full rewrite is not</w:t>
-            </w:r>
-          </w:p>
-        </w:tc>
-      </w:tr>
-    </w:tbl>
-    <w:p>
-      <w:pPr>
-        <w:spacing w:after="100"/>
-      </w:pPr>
-    </w:p>
-    <w:p>
-      <w:pPr>
-        <w:spacing w:after="60" w:before="60"/>
-      </w:pPr>
-      <w:r>
-        <w:rPr>
-          <w:rFonts w:ascii="Times New Roman" w:cs="Times New Roman" w:eastAsia="Times New Roman" w:hAnsi="Times New Roman"/>
-          <w:b/>
-          <w:bCs/>
-          <w:color w:val="5A5A52"/>
-          <w:sz w:val="18"/>
-          <w:szCs w:val="18"/>
-        </w:rPr>
-        <w:t xml:space="preserve">Speaker notes.  </w:t>
-      </w:r>
-      <w:r>
-        <w:rPr>
-          <w:rFonts w:ascii="Times New Roman" w:cs="Times New Roman" w:eastAsia="Times New Roman" w:hAnsi="Times New Roman"/>
-          <w:color w:val="5A5A52"/>
-          <w:sz w:val="18"/>
-          <w:szCs w:val="18"/>
-        </w:rPr>
-        <w:t xml:space="preserve">Deliver this confidently, not apologetically. If pressed on the last row: the events table is append only and witnesses the fingerprint, so editing one record is reported. Defeating it means dropping the trigger and rewriting every table.</w:t>
-      </w:r>
-    </w:p>
-    <w:p>
-      <w:pPr>
-        <w:pBdr>
-          <w:bottom w:val="single" w:color="C9C9BF" w:sz="4" w:space="8"/>
-        </w:pBdr>
-        <w:spacing w:after="200" w:before="200"/>
-      </w:pPr>
-    </w:p>
-    <w:p>
-      <w:pPr>
-        <w:spacing w:after="60"/>
-      </w:pPr>
-      <w:r>
-        <w:rPr>
-          <w:rFonts w:ascii="Times New Roman" w:cs="Times New Roman" w:eastAsia="Times New Roman" w:hAnsi="Times New Roman"/>
-          <w:b/>
-          <w:bCs/>
-          <w:caps/>
-          <w:color w:val="5A5A52"/>
-          <w:sz w:val="16"/>
-          <w:szCs w:val="16"/>
-        </w:rPr>
-        <w:t xml:space="preserve">Slide 13</w:t>
       </w:r>
       <w:r>
         <w:rPr>

</xml_diff>